<commit_message>
docs: sync local study updates
</commit_message>
<xml_diff>
--- a/LLM/LLM.docx
+++ b/LLM/LLM.docx
@@ -4,8 +4,44 @@
   <w:body>
     <w:p>
       <w:pPr>
+        <w:ind w:firstLineChars="0" w:firstLine="0"/>
+        <w:rPr>
+          <w:rFonts w:hint="eastAsia"/>
+        </w:rPr>
+      </w:pPr>
+      <w:r>
+        <w:rPr>
+          <w:rFonts w:hint="eastAsia"/>
+        </w:rPr>
+        <w:t>2026</w:t>
+      </w:r>
+      <w:r>
+        <w:rPr>
+          <w:rFonts w:hint="eastAsia"/>
+        </w:rPr>
+        <w:t>年</w:t>
+      </w:r>
+      <w:r>
+        <w:rPr>
+          <w:rFonts w:hint="eastAsia"/>
+        </w:rPr>
+        <w:t>4.10</w:t>
+      </w:r>
+      <w:r>
+        <w:rPr>
+          <w:rFonts w:hint="eastAsia"/>
+        </w:rPr>
+        <w:t>整理</w:t>
+      </w:r>
+    </w:p>
+    <w:p>
+      <w:pPr>
         <w:pStyle w:val="af2"/>
-        <w:rPr>
+        <w:tabs>
+          <w:tab w:val="left" w:pos="993"/>
+        </w:tabs>
+        <w:rPr>
+          <w:rFonts w:hint="eastAsia"/>
           <w:szCs w:val="32"/>
         </w:rPr>
       </w:pPr>
@@ -171,25 +207,7 @@
           <w:sz w:val="26"/>
           <w:szCs w:val="26"/>
         </w:rPr>
-        <w:t>）</w:t>
-      </w:r>
-      <w:r>
-        <w:rPr>
-          <w:rFonts w:hint="eastAsia"/>
-          <w:color w:val="000000" w:themeColor="text1"/>
-          <w:sz w:val="26"/>
-          <w:szCs w:val="26"/>
-        </w:rPr>
-        <w:t>：仅</w:t>
-      </w:r>
-      <w:r>
-        <w:rPr>
-          <w:rFonts w:hint="eastAsia"/>
-          <w:color w:val="000000" w:themeColor="text1"/>
-          <w:sz w:val="26"/>
-          <w:szCs w:val="26"/>
-        </w:rPr>
-        <w:t>调整</w:t>
+        <w:t>）：仅调整</w:t>
       </w:r>
       <w:r>
         <w:rPr>
@@ -207,16 +225,7 @@
           <w:sz w:val="26"/>
           <w:szCs w:val="26"/>
         </w:rPr>
-        <w:t>就能</w:t>
-      </w:r>
-      <w:r>
-        <w:rPr>
-          <w:rFonts w:hint="eastAsia"/>
-          <w:color w:val="000000" w:themeColor="text1"/>
-          <w:sz w:val="26"/>
-          <w:szCs w:val="26"/>
-        </w:rPr>
-        <w:t>激发</w:t>
+        <w:t>就能激发</w:t>
       </w:r>
       <w:r>
         <w:rPr>
@@ -366,16 +375,7 @@
           <w:sz w:val="26"/>
           <w:szCs w:val="26"/>
         </w:rPr>
-        <w:t>）</w:t>
-      </w:r>
-      <w:r>
-        <w:rPr>
-          <w:rFonts w:hint="eastAsia"/>
-          <w:color w:val="000000" w:themeColor="text1"/>
-          <w:sz w:val="26"/>
-          <w:szCs w:val="26"/>
-        </w:rPr>
-        <w:t>：</w:t>
+        <w:t>）：</w:t>
       </w:r>
       <w:r>
         <w:rPr>
@@ -660,7 +660,6 @@
       <w:pPr>
         <w:ind w:firstLineChars="0" w:firstLine="0"/>
         <w:rPr>
-          <w:rFonts w:hint="eastAsia"/>
           <w:color w:val="000000" w:themeColor="text1"/>
           <w:sz w:val="26"/>
           <w:szCs w:val="26"/>
@@ -838,16 +837,6 @@
       <w:pPr>
         <w:ind w:firstLineChars="0" w:firstLine="0"/>
         <w:outlineLvl w:val="2"/>
-        <w:rPr>
-          <w:rFonts w:cs="Times New Roman" w:hint="eastAsia"/>
-          <w:b/>
-          <w:bCs/>
-          <w:color w:val="C00000"/>
-          <w:sz w:val="26"/>
-          <w:szCs w:val="26"/>
-        </w:rPr>
-      </w:pPr>
-      <w:r>
         <w:rPr>
           <w:rFonts w:cs="Times New Roman"/>
           <w:b/>
@@ -856,183 +845,192 @@
           <w:sz w:val="26"/>
           <w:szCs w:val="26"/>
         </w:rPr>
-        <w:t>Pretrain</w:t>
-      </w:r>
-    </w:p>
-    <w:p>
-      <w:pPr>
-        <w:ind w:firstLineChars="0" w:firstLine="420"/>
-        <w:rPr>
-          <w:color w:val="000000" w:themeColor="text1"/>
-          <w:sz w:val="26"/>
-          <w:szCs w:val="26"/>
-        </w:rPr>
-      </w:pPr>
-      <w:r>
-        <w:rPr>
-          <w:color w:val="000000" w:themeColor="text1"/>
-          <w:sz w:val="26"/>
-          <w:szCs w:val="26"/>
-        </w:rPr>
-        <w:t>LLM</w:t>
-      </w:r>
-      <w:r>
-        <w:rPr>
-          <w:color w:val="000000" w:themeColor="text1"/>
-          <w:sz w:val="26"/>
-          <w:szCs w:val="26"/>
-        </w:rPr>
-        <w:t>几乎都采用了</w:t>
-      </w:r>
-      <w:r>
-        <w:rPr>
-          <w:color w:val="000000" w:themeColor="text1"/>
-          <w:sz w:val="26"/>
-          <w:szCs w:val="26"/>
-        </w:rPr>
-        <w:t>Decoder-Only</w:t>
-      </w:r>
-      <w:r>
-        <w:rPr>
-          <w:color w:val="000000" w:themeColor="text1"/>
-          <w:sz w:val="26"/>
-          <w:szCs w:val="26"/>
-        </w:rPr>
-        <w:t>的类</w:t>
-      </w:r>
-      <w:r>
-        <w:rPr>
-          <w:color w:val="000000" w:themeColor="text1"/>
-          <w:sz w:val="26"/>
-          <w:szCs w:val="26"/>
-        </w:rPr>
-        <w:t>GPT</w:t>
-      </w:r>
-      <w:r>
-        <w:rPr>
-          <w:color w:val="000000" w:themeColor="text1"/>
-          <w:sz w:val="26"/>
-          <w:szCs w:val="26"/>
-        </w:rPr>
-        <w:t>架构</w:t>
-      </w:r>
-      <w:r>
-        <w:rPr>
-          <w:rFonts w:hint="eastAsia"/>
-          <w:color w:val="000000" w:themeColor="text1"/>
-          <w:sz w:val="26"/>
-          <w:szCs w:val="26"/>
-        </w:rPr>
-        <w:t>，预训练任务也是</w:t>
-      </w:r>
-      <w:r>
-        <w:rPr>
-          <w:rFonts w:hint="eastAsia"/>
-          <w:color w:val="000000" w:themeColor="text1"/>
-          <w:sz w:val="26"/>
-          <w:szCs w:val="26"/>
-        </w:rPr>
-        <w:t>CLM</w:t>
-      </w:r>
-      <w:r>
-        <w:rPr>
-          <w:rFonts w:hint="eastAsia"/>
-          <w:color w:val="000000" w:themeColor="text1"/>
-          <w:sz w:val="26"/>
-          <w:szCs w:val="26"/>
-        </w:rPr>
-        <w:t>。</w:t>
-      </w:r>
-      <w:r>
-        <w:rPr>
-          <w:rFonts w:hint="eastAsia"/>
-          <w:color w:val="000000" w:themeColor="text1"/>
-          <w:sz w:val="26"/>
-          <w:szCs w:val="26"/>
-        </w:rPr>
-        <w:t>但是，大语言模型的训练是十分耗费资源，因此大家开始采用</w:t>
-      </w:r>
-      <w:r>
-        <w:rPr>
-          <w:rFonts w:hint="eastAsia"/>
+      </w:pPr>
+      <w:r>
+        <w:rPr>
+          <w:rFonts w:cs="Times New Roman"/>
           <w:b/>
           <w:bCs/>
           <w:color w:val="C00000"/>
           <w:sz w:val="26"/>
           <w:szCs w:val="26"/>
         </w:rPr>
-        <w:t>分布式训练框架</w:t>
-      </w:r>
-      <w:r>
-        <w:rPr>
-          <w:rFonts w:hint="eastAsia"/>
-          <w:color w:val="000000" w:themeColor="text1"/>
-          <w:sz w:val="26"/>
-          <w:szCs w:val="26"/>
-        </w:rPr>
-        <w:t>。</w:t>
+        <w:t>Pretrain</w:t>
       </w:r>
     </w:p>
     <w:p>
       <w:pPr>
-        <w:ind w:firstLineChars="0" w:firstLine="0"/>
-        <w:rPr>
-          <w:rFonts w:hint="eastAsia"/>
-          <w:color w:val="000000" w:themeColor="text1"/>
-          <w:sz w:val="26"/>
-          <w:szCs w:val="26"/>
-        </w:rPr>
-      </w:pPr>
-      <w:r>
-        <w:rPr>
-          <w:rFonts w:hint="eastAsia"/>
-          <w:color w:val="000000" w:themeColor="text1"/>
-          <w:sz w:val="26"/>
-          <w:szCs w:val="26"/>
-        </w:rPr>
-        <w:t>(</w:t>
-      </w:r>
-      <w:r>
-        <w:rPr>
-          <w:rFonts w:hint="eastAsia"/>
+        <w:ind w:firstLineChars="0" w:firstLine="420"/>
+        <w:rPr>
+          <w:color w:val="000000" w:themeColor="text1"/>
+          <w:sz w:val="26"/>
+          <w:szCs w:val="26"/>
+        </w:rPr>
+      </w:pPr>
+      <w:r>
+        <w:rPr>
+          <w:color w:val="000000" w:themeColor="text1"/>
+          <w:sz w:val="26"/>
+          <w:szCs w:val="26"/>
+        </w:rPr>
+        <w:lastRenderedPageBreak/>
+        <w:t>LLM</w:t>
+      </w:r>
+      <w:r>
+        <w:rPr>
+          <w:color w:val="000000" w:themeColor="text1"/>
+          <w:sz w:val="26"/>
+          <w:szCs w:val="26"/>
+        </w:rPr>
+        <w:t>几乎都采用了</w:t>
+      </w:r>
+      <w:r>
+        <w:rPr>
+          <w:color w:val="000000" w:themeColor="text1"/>
+          <w:sz w:val="26"/>
+          <w:szCs w:val="26"/>
+        </w:rPr>
+        <w:t>Decoder-Only</w:t>
+      </w:r>
+      <w:r>
+        <w:rPr>
+          <w:color w:val="000000" w:themeColor="text1"/>
+          <w:sz w:val="26"/>
+          <w:szCs w:val="26"/>
+        </w:rPr>
+        <w:t>的类</w:t>
+      </w:r>
+      <w:r>
+        <w:rPr>
+          <w:color w:val="000000" w:themeColor="text1"/>
+          <w:sz w:val="26"/>
+          <w:szCs w:val="26"/>
+        </w:rPr>
+        <w:t>GPT</w:t>
+      </w:r>
+      <w:r>
+        <w:rPr>
+          <w:color w:val="000000" w:themeColor="text1"/>
+          <w:sz w:val="26"/>
+          <w:szCs w:val="26"/>
+        </w:rPr>
+        <w:t>架构</w:t>
+      </w:r>
+      <w:r>
+        <w:rPr>
+          <w:rFonts w:hint="eastAsia"/>
+          <w:color w:val="000000" w:themeColor="text1"/>
+          <w:sz w:val="26"/>
+          <w:szCs w:val="26"/>
+        </w:rPr>
+        <w:t>，预训练任务也是</w:t>
+      </w:r>
+      <w:r>
+        <w:rPr>
+          <w:rFonts w:hint="eastAsia"/>
+          <w:color w:val="000000" w:themeColor="text1"/>
+          <w:sz w:val="26"/>
+          <w:szCs w:val="26"/>
+        </w:rPr>
+        <w:t>CLM</w:t>
+      </w:r>
+      <w:r>
+        <w:rPr>
+          <w:rFonts w:hint="eastAsia"/>
+          <w:color w:val="000000" w:themeColor="text1"/>
+          <w:sz w:val="26"/>
+          <w:szCs w:val="26"/>
+        </w:rPr>
+        <w:t>。</w:t>
+      </w:r>
+      <w:r>
+        <w:rPr>
+          <w:rFonts w:hint="eastAsia"/>
+          <w:color w:val="000000" w:themeColor="text1"/>
+          <w:sz w:val="26"/>
+          <w:szCs w:val="26"/>
+        </w:rPr>
+        <w:t>但是，大语言模型的训练是十分耗费资源，因此大家开始采用</w:t>
+      </w:r>
+      <w:r>
+        <w:rPr>
+          <w:rFonts w:hint="eastAsia"/>
+          <w:b/>
+          <w:bCs/>
           <w:color w:val="C00000"/>
           <w:sz w:val="26"/>
           <w:szCs w:val="26"/>
         </w:rPr>
-        <w:t>注：</w:t>
-      </w:r>
-      <w:r>
-        <w:rPr>
-          <w:rFonts w:hint="eastAsia"/>
-          <w:color w:val="000000" w:themeColor="text1"/>
-          <w:sz w:val="26"/>
-          <w:szCs w:val="26"/>
-        </w:rPr>
-        <w:t>分布式训练的核心是数据并行，模型并行，</w:t>
-      </w:r>
-      <w:r>
-        <w:rPr>
-          <w:color w:val="000000" w:themeColor="text1"/>
-          <w:sz w:val="26"/>
-          <w:szCs w:val="26"/>
-        </w:rPr>
-        <w:t>流水线并行</w:t>
-      </w:r>
-      <w:r>
-        <w:rPr>
-          <w:rFonts w:hint="eastAsia"/>
-          <w:color w:val="000000" w:themeColor="text1"/>
-          <w:sz w:val="26"/>
-          <w:szCs w:val="26"/>
-        </w:rPr>
-        <w:t>)</w:t>
+        <w:t>分布式训练框架</w:t>
+      </w:r>
+      <w:r>
+        <w:rPr>
+          <w:rFonts w:hint="eastAsia"/>
+          <w:color w:val="000000" w:themeColor="text1"/>
+          <w:sz w:val="26"/>
+          <w:szCs w:val="26"/>
+        </w:rPr>
+        <w:t>。</w:t>
       </w:r>
     </w:p>
     <w:p>
       <w:pPr>
+        <w:ind w:firstLineChars="0" w:firstLine="0"/>
+        <w:rPr>
+          <w:color w:val="000000" w:themeColor="text1"/>
+          <w:sz w:val="26"/>
+          <w:szCs w:val="26"/>
+        </w:rPr>
+      </w:pPr>
+      <w:r>
+        <w:rPr>
+          <w:rFonts w:hint="eastAsia"/>
+          <w:color w:val="000000" w:themeColor="text1"/>
+          <w:sz w:val="26"/>
+          <w:szCs w:val="26"/>
+        </w:rPr>
+        <w:t>(</w:t>
+      </w:r>
+      <w:r>
+        <w:rPr>
+          <w:rFonts w:hint="eastAsia"/>
+          <w:color w:val="C00000"/>
+          <w:sz w:val="26"/>
+          <w:szCs w:val="26"/>
+        </w:rPr>
+        <w:t>注：</w:t>
+      </w:r>
+      <w:r>
+        <w:rPr>
+          <w:rFonts w:hint="eastAsia"/>
+          <w:color w:val="000000" w:themeColor="text1"/>
+          <w:sz w:val="26"/>
+          <w:szCs w:val="26"/>
+        </w:rPr>
+        <w:t>分布式训练的核心是数据并行，模型并行，</w:t>
+      </w:r>
+      <w:r>
+        <w:rPr>
+          <w:color w:val="000000" w:themeColor="text1"/>
+          <w:sz w:val="26"/>
+          <w:szCs w:val="26"/>
+        </w:rPr>
+        <w:t>流水线并行</w:t>
+      </w:r>
+      <w:r>
+        <w:rPr>
+          <w:rFonts w:hint="eastAsia"/>
+          <w:color w:val="000000" w:themeColor="text1"/>
+          <w:sz w:val="26"/>
+          <w:szCs w:val="26"/>
+        </w:rPr>
+        <w:t>)</w:t>
+      </w:r>
+    </w:p>
+    <w:p>
+      <w:pPr>
         <w:ind w:firstLineChars="0"/>
         <w:rPr>
-          <w:rFonts w:hint="eastAsia"/>
           <w:color w:val="000000" w:themeColor="text1"/>
           <w:sz w:val="26"/>
           <w:szCs w:val="26"/>
@@ -1129,16 +1127,7 @@
           <w:sz w:val="26"/>
           <w:szCs w:val="26"/>
         </w:rPr>
-        <w:t>如上图所示，数据并行：</w:t>
-      </w:r>
-      <w:r>
-        <w:rPr>
-          <w:rFonts w:hint="eastAsia"/>
-          <w:color w:val="000000" w:themeColor="text1"/>
-          <w:sz w:val="26"/>
-          <w:szCs w:val="26"/>
-        </w:rPr>
-        <w:t>每张</w:t>
+        <w:t>如上图所示，数据并行：每张</w:t>
       </w:r>
       <w:r>
         <w:rPr>
@@ -1436,6 +1425,7 @@
           <w:sz w:val="26"/>
           <w:szCs w:val="26"/>
         </w:rPr>
+        <w:lastRenderedPageBreak/>
         <w:t>如：</w:t>
       </w:r>
       <w:r>
@@ -1901,7 +1891,6 @@
       <w:pPr>
         <w:ind w:firstLineChars="400" w:firstLine="1040"/>
         <w:rPr>
-          <w:rFonts w:hint="eastAsia"/>
           <w:color w:val="000000" w:themeColor="text1"/>
           <w:sz w:val="26"/>
           <w:szCs w:val="26"/>
@@ -2216,7 +2205,6 @@
       <w:pPr>
         <w:ind w:firstLineChars="0" w:firstLine="0"/>
         <w:rPr>
-          <w:rFonts w:hint="eastAsia"/>
           <w:color w:val="000000" w:themeColor="text1"/>
           <w:sz w:val="26"/>
           <w:szCs w:val="26"/>
@@ -2587,7 +2575,16 @@
           <w:sz w:val="26"/>
           <w:szCs w:val="26"/>
         </w:rPr>
-        <w:t>：第</w:t>
+        <w:t>：</w:t>
+      </w:r>
+      <w:r>
+        <w:rPr>
+          <w:color w:val="000000" w:themeColor="text1"/>
+          <w:sz w:val="26"/>
+          <w:szCs w:val="26"/>
+        </w:rPr>
+        <w:lastRenderedPageBreak/>
+        <w:t>第</w:t>
       </w:r>
       <w:r>
         <w:rPr>
@@ -3004,7 +3001,6 @@
         <w:ind w:firstLineChars="0" w:firstLine="0"/>
         <w:outlineLvl w:val="2"/>
         <w:rPr>
-          <w:rFonts w:hint="eastAsia"/>
           <w:b/>
           <w:bCs/>
           <w:color w:val="C00000"/>
@@ -3059,7 +3055,6 @@
       <w:r>
         <w:rPr>
           <w:rStyle w:val="af9"/>
-          <w:rFonts w:hint="eastAsia"/>
           <w:b/>
           <w:bCs/>
           <w:color w:val="C00000"/>
@@ -3084,7 +3079,6 @@
           <w:sz w:val="26"/>
           <w:szCs w:val="26"/>
         </w:rPr>
-        <w:lastRenderedPageBreak/>
         <w:t>之所需要这一步的原因就是，仅仅通过预训练获得的</w:t>
       </w:r>
       <w:r>
@@ -3638,7 +3632,6 @@
       <w:pPr>
         <w:ind w:firstLineChars="0" w:firstLine="0"/>
         <w:rPr>
-          <w:rFonts w:hint="eastAsia"/>
           <w:sz w:val="26"/>
           <w:szCs w:val="26"/>
         </w:rPr>
@@ -3702,7 +3695,6 @@
         <w:ind w:firstLineChars="0" w:firstLine="0"/>
         <w:outlineLvl w:val="2"/>
         <w:rPr>
-          <w:rFonts w:hint="eastAsia"/>
           <w:b/>
           <w:bCs/>
           <w:color w:val="C00000"/>
@@ -3768,6 +3760,7 @@
           <w:sz w:val="26"/>
           <w:szCs w:val="26"/>
         </w:rPr>
+        <w:lastRenderedPageBreak/>
         <w:t>RLHF</w:t>
       </w:r>
       <w:r>
@@ -3919,7 +3912,6 @@
         <w:rPr>
           <w:noProof/>
         </w:rPr>
-        <w:lastRenderedPageBreak/>
         <w:drawing>
           <wp:inline distT="0" distB="0" distL="0" distR="0" wp14:anchorId="2E323E85" wp14:editId="2A358F6B">
             <wp:extent cx="5731510" cy="3486150"/>
@@ -4118,7 +4110,6 @@
       <w:pPr>
         <w:ind w:firstLineChars="0" w:firstLine="420"/>
         <w:rPr>
-          <w:rFonts w:hint="eastAsia"/>
           <w:color w:val="000000" w:themeColor="text1"/>
           <w:sz w:val="26"/>
           <w:szCs w:val="26"/>
@@ -4375,7 +4366,16 @@
           <w:sz w:val="26"/>
           <w:szCs w:val="26"/>
         </w:rPr>
-        <w:t>即使他们不是直接面对你。为了安全起见</w:t>
+        <w:t>即使他们不是直接面对你。为了安全</w:t>
+      </w:r>
+      <w:r>
+        <w:rPr>
+          <w:color w:val="000000" w:themeColor="text1"/>
+          <w:sz w:val="26"/>
+          <w:szCs w:val="26"/>
+        </w:rPr>
+        <w:lastRenderedPageBreak/>
+        <w:t>起见</w:t>
       </w:r>
       <w:r>
         <w:rPr>
@@ -4440,7 +4440,6 @@
       <w:pPr>
         <w:ind w:firstLineChars="0" w:firstLine="0"/>
         <w:rPr>
-          <w:rFonts w:hint="eastAsia"/>
           <w:b/>
           <w:bCs/>
           <w:color w:val="C00000"/>
@@ -6568,6 +6567,7 @@
   <w:style w:type="character" w:default="1" w:styleId="a0">
     <w:name w:val="Default Paragraph Font"/>
     <w:uiPriority w:val="1"/>
+    <w:semiHidden/>
     <w:unhideWhenUsed/>
   </w:style>
   <w:style w:type="table" w:default="1" w:styleId="a1">

</xml_diff>